<commit_message>
Remove phone number from resume
Co-authored-by: Copilot <223556219+Copilot@users.noreply.github.com>

Copilot-Session: 63d09d05-0e70-4925-a9d5-bb3381e9049a
</commit_message>
<xml_diff>
--- a/assets/documents/Nithin-Artham-Resume.docx
+++ b/assets/documents/Nithin-Artham-Resume.docx
@@ -64,47 +64,6 @@
           <w:b/>
         </w:rPr>
         <w:t>E: nithin.artham@gmail.com</w:t>
-      </w:r>
-    </w:p>
-    <w:p>
-      <w:pPr>
-        <w:pBdr>
-          <w:bottom w:val="single" w:sz="12" w:space="1" w:color="auto"/>
-        </w:pBdr>
-        <w:jc w:val="center"/>
-        <w:rPr>
-          <w:b/>
-        </w:rPr>
-      </w:pPr>
-      <w:r>
-        <w:rPr>
-          <w:b/>
-        </w:rPr>
-        <w:t>P</w:t>
-      </w:r>
-      <w:r>
-        <w:rPr>
-          <w:b/>
-        </w:rPr>
-        <w:t>h-</w:t>
-      </w:r>
-      <w:r>
-        <w:rPr>
-          <w:b/>
-        </w:rPr>
-        <w:t>No:</w:t>
-      </w:r>
-      <w:r>
-        <w:rPr>
-          <w:b/>
-        </w:rPr>
-        <w:t xml:space="preserve"> </w:t>
-      </w:r>
-      <w:r>
-        <w:rPr>
-          <w:b/>
-        </w:rPr>
-        <w:t>2036906786</w:t>
       </w:r>
     </w:p>
     <w:p>

</xml_diff>